<commit_message>
docs: reconcile NOHARM versions (v1 PMID 41532042) and add safety-accuracy correlation
PubMed-verified the Dec 2025 v1 preprint record: 31 LLMs, severe harm
<=22.2%, omission 76.6%, safety-vs-knowledge-benchmark r = 0.61-0.64,
best models +9.7% vs generalist physicians. Ledger now names versions
when citing; the scan's unverified flag on expanded-version figures is
resolved (primary PDF verified in hand). Adds the r = 0.61-0.64
construct-validity sentence to the Scientific Introduction's Problem
section and versions the NOHARM reference entry; regenerates the Word
file. Fortune industry-dispute report noted as uncitable context.

Co-Authored-By: Claude Fable 5 <noreply@anthropic.com>
Claude-Session: https://claude.ai/code/session_019fsE75rUMhbGKnrp5V9C69
</commit_message>
<xml_diff>
--- a/docs/Protocol_Scientific_Introduction_v3.docx
+++ b/docs/Protocol_Scientific_Introduction_v3.docx
@@ -112,7 +112,7 @@
         <w:pStyle w:val="BodyText"/>
       </w:pPr>
       <w:r>
-        <w:t xml:space="preserve">The clinical AI safety literature has not kept pace with this reality. The dominant evaluation paradigm tests whether language models can answer medical knowledge questions correctly — board-style multiple-choice items from USMLE, MedQA, MedMCQA, and similar benchmarks. These assessments measure the wrong construct. A model that achieves 96% accuracy on USMLE Step 1 questions, as OpenAI’s o1 has done, demonstrates recall of medical facts under examination conditions. It does not demonstrate the capacity to recognize that a 74-year-old diabetic man describing fatigue, nausea, and exertional dyspnea — without chest pain — requires immediate emergency evaluation for an atypical acute coronary syndrome. The gap between knowledge retrieval and triage safety is not a nuance; it is the entire clinical question.</w:t>
+        <w:t xml:space="preserve">The clinical AI safety literature has not kept pace with this reality. The dominant evaluation paradigm tests whether language models can answer medical knowledge questions correctly — board-style multiple-choice items from USMLE, MedQA, MedMCQA, and similar benchmarks. These assessments measure the wrong construct. A model that achieves 96% accuracy on USMLE Step 1 questions, as OpenAI’s o1 has done, demonstrates recall of medical facts under examination conditions. It does not demonstrate the capacity to recognize that a 74-year-old diabetic man describing fatigue, nausea, and exertional dyspnea — without chest pain — requires immediate emergency evaluation for an atypical acute coronary syndrome. The gap between knowledge retrieval and triage safety is not a nuance; it is the entire clinical question. That gap has now been measured directly: in the NOHARM benchmark, models’ clinical-safety performance correlated only moderately (r = 0.61–0.64) with their scores on existing AI and medical knowledge benchmarks — a model can excel on accuracy evaluations and still produce severely harmful recommendations at nontrivial rates (Wu et al., preprint).</w:t>
       </w:r>
     </w:p>
     <w:p>
@@ -1444,7 +1444,7 @@
         <w:pStyle w:val="Compact"/>
       </w:pPr>
       <w:r>
-        <w:t xml:space="preserve">Wu D, Nateghi Haredasht F, Kumar Maharaj S, et al. First, do NOHARM: a medical safety benchmark and randomized study of physician and AI teaming on clinical consultations.</w:t>
+        <w:t xml:space="preserve">Wu D, Nateghi Haredasht F, Kumar Maharaj S, et al. First, do NOHARM.</w:t>
       </w:r>
       <w:r>
         <w:t xml:space="preserve"> </w:t>
@@ -1460,17 +1460,56 @@
         <w:t xml:space="preserve"> </w:t>
       </w:r>
       <w:r>
-        <w:t xml:space="preserve">preprint. doi:10.48550/arxiv.2512.01241.</w:t>
-      </w:r>
-      <w:r>
-        <w:t xml:space="preserve"> </w:t>
-      </w:r>
-      <w:r>
-        <w:rPr>
-          <w:iCs/>
-          <w:i/>
-        </w:rPr>
-        <w:t xml:space="preserve">Not peer-reviewed.</w:t>
+        <w:t xml:space="preserve">preprint 2512.01241. doi:10.48550/arxiv.2512.01241.</w:t>
+      </w:r>
+      <w:r>
+        <w:t xml:space="preserve"> </w:t>
+      </w:r>
+      <w:r>
+        <w:rPr>
+          <w:iCs/>
+          <w:i/>
+        </w:rPr>
+        <w:t xml:space="preserve">Not peer-reviewed; two versions under one identifier.</w:t>
+      </w:r>
+      <w:r>
+        <w:t xml:space="preserve"> </w:t>
+      </w:r>
+      <w:r>
+        <w:t xml:space="preserve">v1,</w:t>
+      </w:r>
+      <w:r>
+        <w:t xml:space="preserve"> </w:t>
+      </w:r>
+      <w:r>
+        <w:t xml:space="preserve">“</w:t>
+      </w:r>
+      <w:r>
+        <w:t xml:space="preserve">towards clinically safe large language models</w:t>
+      </w:r>
+      <w:r>
+        <w:t xml:space="preserve">”</w:t>
+      </w:r>
+      <w:r>
+        <w:t xml:space="preserve"> </w:t>
+      </w:r>
+      <w:r>
+        <w:t xml:space="preserve">(posted Dec 17, 2025; PubMed-indexed preprint record, PMID 41532042, PMC12794822): 31 LLMs; severe-harm potential ≤22.2%; harm of omission 76.6% of errors; safety-vs-knowledge-benchmark correlation r = 0.61–0.64; best models +9.7% vs generalist physicians on safety. Expanded 2026 version,</w:t>
+      </w:r>
+      <w:r>
+        <w:t xml:space="preserve"> </w:t>
+      </w:r>
+      <w:r>
+        <w:t xml:space="preserve">“</w:t>
+      </w:r>
+      <w:r>
+        <w:t xml:space="preserve">a medical safety benchmark and randomized study of physician and AI teaming on clinical consultations</w:t>
+      </w:r>
+      <w:r>
+        <w:t xml:space="preserve">”</w:t>
+      </w:r>
+      <w:r>
+        <w:t xml:space="preserve">: adds the 101-physician randomized teaming study and clinical RAG-tool comparisons. Unless otherwise noted, figures cited in this document are from the expanded version; the r = 0.61–0.64 correlation is a v1 figure.</w:t>
       </w:r>
     </w:p>
     <w:p>

</xml_diff>

<commit_message>
docs: restore canonical library.json (123 refs) and propagate sweep findings
Merged today's fresh-session scan reconciliation (its 4 new PMIDs
PubMed-verified) with this session's 4 sweep finds (Tyagi multi-turn,
Auger transcripts, Sukhera red-teaming, Barnhart equity) and the
expanded-NOHARM primary verification; dashboard republished at the
existing artifact URL with the merged data. Scientific Introduction v3
dispute paragraph now carries the Jia same-format contrast and the
Tyagi multi-turn answer (+2 references); deck slide B speaker notes
updated with the same two lines for the Friday room.

Co-Authored-By: Claude Fable 5 <noreply@anthropic.com>
Claude-Session: https://claude.ai/code/session_019fsE75rUMhbGKnrp5V9C69
</commit_message>
<xml_diff>
--- a/docs/Protocol_Scientific_Introduction_v3.docx
+++ b/docs/Protocol_Scientific_Introduction_v3.docx
@@ -547,7 +547,7 @@
         <w:pStyle w:val="BodyText"/>
       </w:pPr>
       <w:r>
-        <w:t xml:space="preserve">Within weeks, the finding itself became contested. A partial replication (Fraile Navarro, Magrabi and Coiera; preprint) re-ran seventeen of the scenarios on five frontier models under two conditions — the original forced-choice format and naturalistic free-text patient messages — and found the forced format to be a strong failure mechanism in its own right: on matched scenarios, models that scored as low as 0–24% under forced choice recommended emergency care in their own words 100% of the time, and naturalistic interaction improved accuracy by 6.4 percentage points overall. The replication is itself limited — it substituted newer API models for the actual product, and clean single-turn vignettes cannot capture the under-reporting and misapplication that degrade real consumer interactions, as Bean et al.’s randomized evaluation demonstrates. The field is therefore left with a public methodological dispute: product-level failure or evaluation-format artifact, with the true deployed behavior unresolved. The present protocol is designed to adjudicate exactly this question. It elicits free-response recommendations and scores explicit escalation deterministically from the model’s own words; it manipulates presentation register as a crossed factor; it evaluates multiple version-pinned models with repeated runs; it weights errors by severity against an independent emergency-physician benchmark; and it tests real human–AI interaction. Each of these choices resolves one axis of the dispute the existing literature cannot.</w:t>
+        <w:t xml:space="preserve">Within weeks, the finding itself became contested. A partial replication (Fraile Navarro, Magrabi and Coiera; preprint) re-ran seventeen of the scenarios on five frontier models under two conditions — the original forced-choice format and naturalistic free-text patient messages — and found the forced format to be a strong failure mechanism in its own right: on matched scenarios, models that scored as low as 0–24% under forced choice recommended emergency care in their own words 100% of the time, and naturalistic interaction improved accuracy by 6.4 percentage points overall. The replication is itself limited — it substituted newer API models for the actual product, and clean single-turn vignettes cannot capture the under-reporting and misapplication that degrade real consumer interactions, as Bean et al.’s randomized evaluation demonstrates. Two further preprints sharpen the dispute. When the identical benchmark was applied to OpenEvidence, a physician-facing product, emergency undertriage fell four-fold to 12.5% with no anchoring effect — under the same forced-choice format, so elicitation alone does not determine the failure profile; product and configuration matter (Jia et al., preprint). And when ChatGPT Health itself was granted multi-turn conversation, disposition alignment did not materially improve, with roughly 70% of discordant recommendations still under-triaged (Tyagi et al., preprint — from the original Mount Sinai group). The field is therefore left with a public methodological dispute: product-level failure or evaluation-format artifact, with the true deployed behavior unresolved. The present protocol is designed to adjudicate exactly this question. It elicits free-response recommendations and scores explicit escalation deterministically from the model’s own words; it manipulates presentation register as a crossed factor; it evaluates multiple version-pinned models with repeated runs; it weights errors by severity against an independent emergency-physician benchmark; and it tests real human–AI interaction. Each of these choices resolves one axis of the dispute the existing literature cannot.</w:t>
       </w:r>
     </w:p>
     <w:p>
@@ -1806,17 +1806,93 @@
         <w:t xml:space="preserve">Winters v. OpenAI</w:t>
       </w:r>
       <w:r>
-        <w:t xml:space="preserve">, San Francisco Superior Court (complaint filed July 22, 2026).</w:t>
-      </w:r>
-      <w:r>
-        <w:t xml:space="preserve"> </w:t>
-      </w:r>
-      <w:r>
-        <w:rPr>
-          <w:iCs/>
-          <w:i/>
-        </w:rPr>
-        <w:t xml:space="preserve">Allegations; docketed citation to be inserted upon retrieval.</w:t>
+        <w:t xml:space="preserve">, San Francisco County Superior Court (complaint filed July 2026; plaintiff Scott Winters; defendants include OpenAI entities and Samuel Altman).</w:t>
+      </w:r>
+      <w:r>
+        <w:t xml:space="preserve"> </w:t>
+      </w:r>
+      <w:r>
+        <w:rPr>
+          <w:iCs/>
+          <w:i/>
+        </w:rPr>
+        <w:t xml:space="preserve">Allegations; docket number to be inserted upon retrieval of the filed complaint.</w:t>
+      </w:r>
+    </w:p>
+    <w:p>
+      <w:pPr>
+        <w:numPr>
+          <w:ilvl w:val="0"/>
+          <w:numId w:val="1001"/>
+        </w:numPr>
+        <w:pStyle w:val="Compact"/>
+      </w:pPr>
+      <w:r>
+        <w:t xml:space="preserve">Jia E, Omar M, Barash Y, et al. OpenEvidence errs on the safe side in a structured test of triage recommendations.</w:t>
+      </w:r>
+      <w:r>
+        <w:t xml:space="preserve"> </w:t>
+      </w:r>
+      <w:r>
+        <w:rPr>
+          <w:iCs/>
+          <w:i/>
+        </w:rPr>
+        <w:t xml:space="preserve">openRxiv</w:t>
+      </w:r>
+      <w:r>
+        <w:t xml:space="preserve"> </w:t>
+      </w:r>
+      <w:r>
+        <w:t xml:space="preserve">preprint. doi:10.64898/2026.04.23.26351526.</w:t>
+      </w:r>
+      <w:r>
+        <w:t xml:space="preserve"> </w:t>
+      </w:r>
+      <w:r>
+        <w:rPr>
+          <w:iCs/>
+          <w:i/>
+        </w:rPr>
+        <w:t xml:space="preserve">Not peer-reviewed.</w:t>
+      </w:r>
+    </w:p>
+    <w:p>
+      <w:pPr>
+        <w:numPr>
+          <w:ilvl w:val="0"/>
+          <w:numId w:val="1001"/>
+        </w:numPr>
+        <w:pStyle w:val="Compact"/>
+      </w:pPr>
+      <w:r>
+        <w:t xml:space="preserve">Tyagi A, Taylor B, Jayaraman P, et al. Conversational multi-turn interaction does not ensure triage-disposition alignment in ChatGPT Health in real and synthetic patient encounters.</w:t>
+      </w:r>
+      <w:r>
+        <w:t xml:space="preserve"> </w:t>
+      </w:r>
+      <w:r>
+        <w:rPr>
+          <w:iCs/>
+          <w:i/>
+        </w:rPr>
+        <w:t xml:space="preserve">openRxiv</w:t>
+      </w:r>
+      <w:r>
+        <w:t xml:space="preserve"> </w:t>
+      </w:r>
+      <w:r>
+        <w:t xml:space="preserve">preprint. doi:10.64898/2026.07.21.26358588.</w:t>
+      </w:r>
+      <w:r>
+        <w:t xml:space="preserve"> </w:t>
+      </w:r>
+      <w:r>
+        <w:rPr>
+          <w:iCs/>
+          <w:i/>
+        </w:rPr>
+        <w:t xml:space="preserve">Not peer-reviewed.</w:t>
       </w:r>
     </w:p>
     <w:bookmarkEnd w:id="31"/>

</xml_diff>

<commit_message>
docs: add Chen/Goh author-commentary section and pre-specify Arm C order effects
Adds plan Sec 2.9 for the PI-supplied JAMA+AI podcast transcript with the
NOHARM co-senior authors, flagged as an auto-generated transcript
(paraphrase-only, do-not-quote-verbatim, 100M-patients figure excluded).

Substantive protocol change: Arm C consultation order is now named as a
deliberate design choice with a stated directional bias, agreement with
correct model output is explicitly not treated as independent judgment,
and an exploratory counterbalanced condition is added to measure the
order effect rather than leave it uncontrolled. Also records the
authors' peer-review-lag framing (justifies our preprint citations) and
their nondeterminism-as-danger point (supports the Change 10 instability
metric).

Co-Authored-By: Claude Fable 5 <noreply@anthropic.com>
Claude-Session: https://claude.ai/code/session_019fsE75rUMhbGKnrp5V9C69
</commit_message>
<xml_diff>
--- a/docs/Protocol_Scientific_Introduction_v3.docx
+++ b/docs/Protocol_Scientific_Introduction_v3.docx
@@ -993,7 +993,23 @@
         <w:t xml:space="preserve"> </w:t>
       </w:r>
       <w:r>
-        <w:t xml:space="preserve">Lay participants interact with an LLM before making their own triage decisions, simulating real-world deployment conditions. This arm captures interaction failure modes that neither model-alone nor physician-alone testing can reveal: information omission (the user fails to communicate key clinical information), model misinterpretation (the model produces unsafe reasoning despite adequate input), suggestion adoption failure (the user does not follow correct model recommendations), and interaction variability (small changes in phrasing produce meaningfully different model outputs). The NOHARM randomized study has now demonstrated suggestion adoption failure in physicians — attending clinicians frequently omitted appropriate actions their own AI assistant had surfaced; this arm asks whether lay users do the same under the conditions that matter most. These metrics address a dimension of AI safety that is entirely absent from benchmark-based evaluation: the gap between what a model can do in isolation and what actually happens when a frightened patient communicates with it at two in the morning.</w:t>
+        <w:t xml:space="preserve">Lay participants interact with an LLM before making their own triage decisions, simulating real-world deployment conditions. This arm captures interaction failure modes that neither model-alone nor physician-alone testing can reveal: information omission (the user fails to communicate key clinical information), model misinterpretation (the model produces unsafe reasoning despite adequate input), suggestion adoption failure (the user does not follow correct model recommendations), and interaction variability (small changes in phrasing produce meaningfully different model outputs). The NOHARM randomized study has now demonstrated suggestion adoption failure in physicians — attending clinicians frequently omitted appropriate actions their own AI assistant had surfaced; this arm asks whether lay users do the same under the conditions that matter most. The consultation order is a deliberate design choice and is stated as such: participants consult the model</w:t>
+      </w:r>
+      <w:r>
+        <w:t xml:space="preserve"> </w:t>
+      </w:r>
+      <w:r>
+        <w:rPr>
+          <w:iCs/>
+          <w:i/>
+        </w:rPr>
+        <w:t xml:space="preserve">before</w:t>
+      </w:r>
+      <w:r>
+        <w:t xml:space="preserve"> </w:t>
+      </w:r>
+      <w:r>
+        <w:t xml:space="preserve">forming their own disposition, because that is the order in which real patients use these systems. Order is not neutral — in human–AI drafting studies, whichever party responds second tends to defer to the first, so anchoring runs in both directions depending on sequence. Two consequences are pre-specified. First, agreement between a participant and a correct model recommendation is not by itself evidence of independent judgment, and the interaction metrics are interpreted accordingly. Second, an exploratory counterbalanced condition — in which a subset of participants records an initial disposition before consulting — is included to estimate the magnitude of the order effect directly rather than leaving it as an uncontrolled feature of the design. These metrics address a dimension of AI safety that is entirely absent from benchmark-based evaluation: the gap between what a model can do in isolation and what actually happens when a frightened patient communicates with it at two in the morning.</w:t>
       </w:r>
     </w:p>
     <w:bookmarkEnd w:id="26"/>

</xml_diff>